<commit_message>
Base FIrst-3 Books of Latter Prophets
EHYEH ASHER EHYEH
</commit_message>
<xml_diff>
--- a/01 Tanakh/02 Nevi_im/02 Latter Prophets/10 Yeshayahu/Yeshayahu 27.docx
+++ b/01 Tanakh/02 Nevi_im/02 Latter Prophets/10 Yeshayahu/Yeshayahu 27.docx
@@ -230,7 +230,7 @@
           <w:szCs w:val="24"/>
           <w:rtl w:val="0"/>
         </w:rPr>
-        <w:t xml:space="preserve">The time is coming when Ya‘akov will take root; Isra’el will bud and flower, and fill the whole world with a harvest.</w:t>
+        <w:t xml:space="preserve">The time is coming when Yakov will take root; Yisrael will bud and flower, and fill the whole world with a harvest.</w:t>
       </w:r>
     </w:p>
     <w:p>
@@ -362,7 +362,7 @@
           <w:szCs w:val="24"/>
           <w:rtl w:val="0"/>
         </w:rPr>
-        <w:t xml:space="preserve">On that day YIHOVEH will beat out the grain between the Euphrates River and the Vadi of Egypt; and you will be gathered, one by one, people of Isra’el!</w:t>
+        <w:t xml:space="preserve">On that day YIHOVEH will beat out the grain between the Euphrat River and the Vadi of Mitzrayim; and you will be gathered, one by one, people of Yisrael!</w:t>
       </w:r>
     </w:p>
     <w:p>
@@ -384,7 +384,7 @@
           <w:szCs w:val="24"/>
           <w:rtl w:val="0"/>
         </w:rPr>
-        <w:t xml:space="preserve">On that day a great shofar will sound. Those lost in the land of Ashur will come, also those scattered through the land of Egypt; and they will worship YIHOVEH on the holy mountain in Yerushalayim.</w:t>
+        <w:t xml:space="preserve">On that day a great shofar will sound. Those lost in the land of Ashur will come, also those scattered through the land of Mitzrayim; and they will worship YIHOVEH on the holy mountain in Yerushalayim.</w:t>
       </w:r>
     </w:p>
     <w:sectPr>

</xml_diff>